<commit_message>
atualização da aula dia 14/09/26
</commit_message>
<xml_diff>
--- a/Apostila/Projeto Space For Men.docx
+++ b/Apostila/Projeto Space For Men.docx
@@ -502,7 +502,6 @@
     </w:p>
     <w:p>
       <w:r>
-        <w:lastRenderedPageBreak/>
         <w:t xml:space="preserve">6-No </w:t>
       </w:r>
       <w:proofErr w:type="spellStart"/>
@@ -889,7 +888,6 @@
     <w:p/>
     <w:p>
       <w:r>
-        <w:lastRenderedPageBreak/>
         <w:t>10- Dividimos a nossa página em duas:</w:t>
       </w:r>
     </w:p>
@@ -1213,7 +1211,6 @@
     <w:p/>
     <w:p>
       <w:r>
-        <w:lastRenderedPageBreak/>
         <w:t xml:space="preserve">13- Para colocar a lista ao lado da imagem mudamos a natureza da lista utilizando </w:t>
       </w:r>
       <w:proofErr w:type="spellStart"/>
@@ -1448,7 +1445,6 @@
     </w:p>
     <w:p>
       <w:r>
-        <w:lastRenderedPageBreak/>
         <w:t>15- Ainda trabalhando com a lista definimos um tamanho para que ela ocupe 20% de largura e colocamos um espaço externo para o lado direito de 15% o</w:t>
       </w:r>
       <w:r>
@@ -2144,7 +2140,6 @@
     </w:p>
     <w:p>
       <w:r>
-        <w:lastRenderedPageBreak/>
         <w:t xml:space="preserve">19-Criamos dois arquivos no projeto produtos.html e o produtos.css e ligamos no </w:t>
       </w:r>
       <w:proofErr w:type="gramStart"/>
@@ -2445,7 +2440,6 @@
     <w:p/>
     <w:p>
       <w:r>
-        <w:lastRenderedPageBreak/>
         <w:t xml:space="preserve">22-Na lista-ordenada incluímos uma ancora, a </w:t>
       </w:r>
       <w:proofErr w:type="spellStart"/>
@@ -2804,7 +2798,6 @@
         <w:rPr>
           <w:noProof/>
         </w:rPr>
-        <w:lastRenderedPageBreak/>
         <mc:AlternateContent>
           <mc:Choice Requires="wps">
             <w:drawing>
@@ -3337,7 +3330,6 @@
         <w:ind w:left="45"/>
       </w:pPr>
       <w:r>
-        <w:lastRenderedPageBreak/>
         <w:t xml:space="preserve">Criamos um arquivo chamado reset.css e adicionamos ao nosso site, ele retirou todo o </w:t>
       </w:r>
       <w:proofErr w:type="spellStart"/>
@@ -3689,7 +3681,6 @@
         <w:rPr>
           <w:noProof/>
         </w:rPr>
-        <w:lastRenderedPageBreak/>
         <w:drawing>
           <wp:inline distT="0" distB="0" distL="0" distR="0" wp14:anchorId="1D522F26" wp14:editId="7D4DBA70">
             <wp:extent cx="4162425" cy="2143125"/>
@@ -3946,7 +3937,6 @@
     </w:p>
     <w:p>
       <w:r>
-        <w:lastRenderedPageBreak/>
         <w:t xml:space="preserve">                                                                     </w:t>
       </w:r>
       <w:r>
@@ -4114,7 +4104,6 @@
     </w:p>
     <w:p>
       <w:r>
-        <w:lastRenderedPageBreak/>
         <w:t xml:space="preserve">  </w:t>
       </w:r>
       <w:r>
@@ -4440,7 +4429,6 @@
     </w:p>
     <w:p>
       <w:r>
-        <w:lastRenderedPageBreak/>
         <w:t xml:space="preserve">36-Determinamos que cada item da lista </w:t>
       </w:r>
       <w:r>
@@ -4787,7 +4775,6 @@
         <w:rPr>
           <w:noProof/>
         </w:rPr>
-        <w:lastRenderedPageBreak/>
         <mc:AlternateContent>
           <mc:Choice Requires="wps">
             <w:drawing>
@@ -5229,7 +5216,6 @@
           <w:b/>
           <w:noProof/>
         </w:rPr>
-        <w:lastRenderedPageBreak/>
         <w:drawing>
           <wp:inline distT="0" distB="0" distL="0" distR="0" wp14:anchorId="2BDFCF89" wp14:editId="44297823">
             <wp:extent cx="3695700" cy="3638550"/>
@@ -5352,7 +5338,6 @@
           <w:b/>
           <w:noProof/>
         </w:rPr>
-        <w:lastRenderedPageBreak/>
         <mc:AlternateContent>
           <mc:Choice Requires="wps">
             <w:drawing>
@@ -5621,7 +5606,6 @@
           <w:b/>
           <w:noProof/>
         </w:rPr>
-        <w:lastRenderedPageBreak/>
         <w:drawing>
           <wp:inline distT="0" distB="0" distL="0" distR="0" wp14:anchorId="441BBA5F" wp14:editId="0076B37F">
             <wp:extent cx="4105275" cy="2304415"/>
@@ -5905,7 +5889,6 @@
         <w:rPr>
           <w:b/>
         </w:rPr>
-        <w:lastRenderedPageBreak/>
         <w:t>47- Ainda trabalhando anda com houver ao passar o mouse adicionamos uma linha em cada item do menu.</w:t>
       </w:r>
     </w:p>
@@ -6431,7 +6414,6 @@
           <w:b/>
           <w:noProof/>
         </w:rPr>
-        <w:lastRenderedPageBreak/>
         <w:drawing>
           <wp:inline distT="0" distB="0" distL="0" distR="0" wp14:anchorId="3EE31856" wp14:editId="29296799">
             <wp:extent cx="2495898" cy="1714739"/>
@@ -6712,6 +6694,9 @@
         </mc:AlternateContent>
       </w:r>
       <w:r>
+        <w:rPr>
+          <w:noProof/>
+        </w:rPr>
         <w:drawing>
           <wp:inline distT="0" distB="0" distL="0" distR="0" wp14:anchorId="78643987" wp14:editId="5F718572">
             <wp:extent cx="3077004" cy="933580"/>
@@ -6833,6 +6818,7 @@
       <w:r>
         <w:rPr>
           <w:b/>
+          <w:noProof/>
         </w:rPr>
         <w:drawing>
           <wp:inline distT="0" distB="0" distL="0" distR="0" wp14:anchorId="1E05BD79" wp14:editId="5D427DFB">
@@ -6939,8 +6925,8 @@
       <w:r>
         <w:rPr>
           <w:b/>
-        </w:rPr>
-        <w:lastRenderedPageBreak/>
+          <w:noProof/>
+        </w:rPr>
         <w:drawing>
           <wp:inline distT="0" distB="0" distL="0" distR="0" wp14:anchorId="6362D6F2" wp14:editId="61DCE890">
             <wp:extent cx="2646680" cy="3438525"/>
@@ -6980,6 +6966,7 @@
       <w:r>
         <w:rPr>
           <w:b/>
+          <w:noProof/>
         </w:rPr>
         <w:drawing>
           <wp:inline distT="0" distB="0" distL="0" distR="0" wp14:anchorId="5472431B" wp14:editId="1AF2B846">
@@ -7024,8 +7011,533 @@
           <w:b/>
         </w:rPr>
       </w:pPr>
+      <w:r>
+        <w:rPr>
+          <w:b/>
+        </w:rPr>
+        <w:t xml:space="preserve">57- Na página contato.html inserimos o </w:t>
+      </w:r>
+      <w:proofErr w:type="spellStart"/>
+      <w:r>
+        <w:rPr>
+          <w:b/>
+        </w:rPr>
+        <w:t>main</w:t>
+      </w:r>
+      <w:proofErr w:type="spellEnd"/>
+      <w:r>
+        <w:rPr>
+          <w:b/>
+        </w:rPr>
+        <w:t xml:space="preserve"> dentro dele adicionamos o </w:t>
+      </w:r>
+      <w:proofErr w:type="spellStart"/>
+      <w:r>
+        <w:rPr>
+          <w:b/>
+        </w:rPr>
+        <w:t>form</w:t>
+      </w:r>
+      <w:proofErr w:type="spellEnd"/>
+      <w:r>
+        <w:rPr>
+          <w:b/>
+        </w:rPr>
+        <w:t xml:space="preserve"> e começamos a trabalhar com </w:t>
+      </w:r>
+      <w:proofErr w:type="spellStart"/>
+      <w:r>
+        <w:rPr>
+          <w:b/>
+        </w:rPr>
+        <w:t>label</w:t>
+      </w:r>
+      <w:proofErr w:type="spellEnd"/>
+      <w:r>
+        <w:rPr>
+          <w:b/>
+        </w:rPr>
+        <w:t xml:space="preserve"> (etiqueta) e input de texto.</w:t>
+      </w:r>
+    </w:p>
+    <w:p>
+      <w:pPr>
+        <w:rPr>
+          <w:b/>
+        </w:rPr>
+      </w:pPr>
+      <w:r>
+        <w:rPr>
+          <w:b/>
+        </w:rPr>
+        <w:drawing>
+          <wp:inline distT="0" distB="0" distL="0" distR="0" wp14:anchorId="2B102997" wp14:editId="0F304BF2">
+            <wp:extent cx="3600450" cy="1590675"/>
+            <wp:effectExtent l="0" t="0" r="0" b="9525"/>
+            <wp:docPr id="111" name="Imagem 111"/>
+            <wp:cNvGraphicFramePr>
+              <a:graphicFrameLocks xmlns:a="http://schemas.openxmlformats.org/drawingml/2006/main" noChangeAspect="1"/>
+            </wp:cNvGraphicFramePr>
+            <a:graphic xmlns:a="http://schemas.openxmlformats.org/drawingml/2006/main">
+              <a:graphicData uri="http://schemas.openxmlformats.org/drawingml/2006/picture">
+                <pic:pic xmlns:pic="http://schemas.openxmlformats.org/drawingml/2006/picture">
+                  <pic:nvPicPr>
+                    <pic:cNvPr id="1" name=""/>
+                    <pic:cNvPicPr/>
+                  </pic:nvPicPr>
+                  <pic:blipFill>
+                    <a:blip r:embed="rId99"/>
+                    <a:stretch>
+                      <a:fillRect/>
+                    </a:stretch>
+                  </pic:blipFill>
+                  <pic:spPr>
+                    <a:xfrm>
+                      <a:off x="0" y="0"/>
+                      <a:ext cx="3600957" cy="1590899"/>
+                    </a:xfrm>
+                    <a:prstGeom prst="rect">
+                      <a:avLst/>
+                    </a:prstGeom>
+                  </pic:spPr>
+                </pic:pic>
+              </a:graphicData>
+            </a:graphic>
+          </wp:inline>
+        </w:drawing>
+      </w:r>
+      <w:r>
+        <w:rPr>
+          <w:b/>
+        </w:rPr>
+        <w:t xml:space="preserve">  </w:t>
+      </w:r>
+    </w:p>
+    <w:p>
+      <w:pPr>
+        <w:rPr>
+          <w:b/>
+        </w:rPr>
+      </w:pPr>
+      <w:r>
+        <w:rPr>
+          <w:b/>
+        </w:rPr>
+        <w:t xml:space="preserve">58- Para unir o </w:t>
+      </w:r>
+      <w:proofErr w:type="spellStart"/>
+      <w:r>
+        <w:rPr>
+          <w:b/>
+        </w:rPr>
+        <w:t>label</w:t>
+      </w:r>
+      <w:proofErr w:type="spellEnd"/>
+      <w:r>
+        <w:rPr>
+          <w:b/>
+        </w:rPr>
+        <w:t xml:space="preserve"> com o input adicionamos o mesmo nome tanto no for da </w:t>
+      </w:r>
+      <w:proofErr w:type="spellStart"/>
+      <w:r>
+        <w:rPr>
+          <w:b/>
+        </w:rPr>
+        <w:t>label</w:t>
+      </w:r>
+      <w:proofErr w:type="spellEnd"/>
+      <w:r>
+        <w:rPr>
+          <w:b/>
+        </w:rPr>
+        <w:t xml:space="preserve"> como no id do input.</w:t>
+      </w:r>
+    </w:p>
+    <w:p>
+      <w:pPr>
+        <w:rPr>
+          <w:b/>
+        </w:rPr>
+      </w:pPr>
+      <w:r>
+        <w:rPr>
+          <w:b/>
+        </w:rPr>
+        <w:drawing>
+          <wp:inline distT="0" distB="0" distL="0" distR="0" wp14:anchorId="59EC5D36" wp14:editId="11368E6B">
+            <wp:extent cx="3648075" cy="1152354"/>
+            <wp:effectExtent l="0" t="0" r="0" b="0"/>
+            <wp:docPr id="112" name="Imagem 112"/>
+            <wp:cNvGraphicFramePr>
+              <a:graphicFrameLocks xmlns:a="http://schemas.openxmlformats.org/drawingml/2006/main" noChangeAspect="1"/>
+            </wp:cNvGraphicFramePr>
+            <a:graphic xmlns:a="http://schemas.openxmlformats.org/drawingml/2006/main">
+              <a:graphicData uri="http://schemas.openxmlformats.org/drawingml/2006/picture">
+                <pic:pic xmlns:pic="http://schemas.openxmlformats.org/drawingml/2006/picture">
+                  <pic:nvPicPr>
+                    <pic:cNvPr id="1" name=""/>
+                    <pic:cNvPicPr/>
+                  </pic:nvPicPr>
+                  <pic:blipFill>
+                    <a:blip r:embed="rId100"/>
+                    <a:stretch>
+                      <a:fillRect/>
+                    </a:stretch>
+                  </pic:blipFill>
+                  <pic:spPr>
+                    <a:xfrm>
+                      <a:off x="0" y="0"/>
+                      <a:ext cx="3732331" cy="1178969"/>
+                    </a:xfrm>
+                    <a:prstGeom prst="rect">
+                      <a:avLst/>
+                    </a:prstGeom>
+                  </pic:spPr>
+                </pic:pic>
+              </a:graphicData>
+            </a:graphic>
+          </wp:inline>
+        </w:drawing>
+      </w:r>
+    </w:p>
+    <w:p>
+      <w:pPr>
+        <w:rPr>
+          <w:b/>
+        </w:rPr>
+      </w:pPr>
+      <w:r>
+        <w:rPr>
+          <w:b/>
+        </w:rPr>
+        <w:t xml:space="preserve">     59- </w:t>
+      </w:r>
+      <w:r>
+        <w:rPr>
+          <w:b/>
+        </w:rPr>
+        <w:t>Para centralizar o conte</w:t>
+      </w:r>
+      <w:r>
+        <w:rPr>
+          <w:b/>
+        </w:rPr>
+        <w:t xml:space="preserve">údo dentro do </w:t>
+      </w:r>
+      <w:proofErr w:type="spellStart"/>
+      <w:r>
+        <w:rPr>
+          <w:b/>
+        </w:rPr>
+        <w:t>main</w:t>
+      </w:r>
+      <w:proofErr w:type="spellEnd"/>
+      <w:r>
+        <w:rPr>
+          <w:b/>
+        </w:rPr>
+        <w:t xml:space="preserve"> demos uma largura e utilizamos o </w:t>
+      </w:r>
+      <w:proofErr w:type="spellStart"/>
+      <w:r>
+        <w:rPr>
+          <w:b/>
+        </w:rPr>
+        <w:t>margin</w:t>
+      </w:r>
+      <w:proofErr w:type="spellEnd"/>
+      <w:r>
+        <w:rPr>
+          <w:b/>
+        </w:rPr>
+        <w:t>: 0 auto conforme imagem:</w:t>
+      </w:r>
+    </w:p>
+    <w:p>
+      <w:pPr>
+        <w:rPr>
+          <w:b/>
+        </w:rPr>
+      </w:pPr>
+      <w:r>
+        <w:rPr>
+          <w:b/>
+        </w:rPr>
+        <w:drawing>
+          <wp:inline distT="0" distB="0" distL="0" distR="0" wp14:anchorId="70475C60" wp14:editId="411C7F7A">
+            <wp:extent cx="1657581" cy="714475"/>
+            <wp:effectExtent l="0" t="0" r="0" b="9525"/>
+            <wp:docPr id="113" name="Imagem 113"/>
+            <wp:cNvGraphicFramePr>
+              <a:graphicFrameLocks xmlns:a="http://schemas.openxmlformats.org/drawingml/2006/main" noChangeAspect="1"/>
+            </wp:cNvGraphicFramePr>
+            <a:graphic xmlns:a="http://schemas.openxmlformats.org/drawingml/2006/main">
+              <a:graphicData uri="http://schemas.openxmlformats.org/drawingml/2006/picture">
+                <pic:pic xmlns:pic="http://schemas.openxmlformats.org/drawingml/2006/picture">
+                  <pic:nvPicPr>
+                    <pic:cNvPr id="1" name=""/>
+                    <pic:cNvPicPr/>
+                  </pic:nvPicPr>
+                  <pic:blipFill>
+                    <a:blip r:embed="rId101"/>
+                    <a:stretch>
+                      <a:fillRect/>
+                    </a:stretch>
+                  </pic:blipFill>
+                  <pic:spPr>
+                    <a:xfrm>
+                      <a:off x="0" y="0"/>
+                      <a:ext cx="1657581" cy="714475"/>
+                    </a:xfrm>
+                    <a:prstGeom prst="rect">
+                      <a:avLst/>
+                    </a:prstGeom>
+                  </pic:spPr>
+                </pic:pic>
+              </a:graphicData>
+            </a:graphic>
+          </wp:inline>
+        </w:drawing>
+      </w:r>
+    </w:p>
+    <w:p>
+      <w:pPr>
+        <w:rPr>
+          <w:b/>
+        </w:rPr>
+      </w:pPr>
+      <w:r>
+        <w:rPr>
+          <w:b/>
+        </w:rPr>
+        <w:t>60- Observamos que nosso formulário estava apertado entre o cabeçalho e o rodapé, inserimos uma altura tanto para cima como para baixo.</w:t>
+      </w:r>
+    </w:p>
+    <w:p>
+      <w:pPr>
+        <w:rPr>
+          <w:b/>
+        </w:rPr>
+      </w:pPr>
+      <w:r>
+        <w:rPr>
+          <w:b/>
+        </w:rPr>
+        <w:drawing>
+          <wp:inline distT="0" distB="0" distL="0" distR="0" wp14:anchorId="04668FC5" wp14:editId="6DA63183">
+            <wp:extent cx="3971157" cy="1733550"/>
+            <wp:effectExtent l="0" t="0" r="0" b="0"/>
+            <wp:docPr id="116" name="Imagem 116"/>
+            <wp:cNvGraphicFramePr>
+              <a:graphicFrameLocks xmlns:a="http://schemas.openxmlformats.org/drawingml/2006/main" noChangeAspect="1"/>
+            </wp:cNvGraphicFramePr>
+            <a:graphic xmlns:a="http://schemas.openxmlformats.org/drawingml/2006/main">
+              <a:graphicData uri="http://schemas.openxmlformats.org/drawingml/2006/picture">
+                <pic:pic xmlns:pic="http://schemas.openxmlformats.org/drawingml/2006/picture">
+                  <pic:nvPicPr>
+                    <pic:cNvPr id="1" name=""/>
+                    <pic:cNvPicPr/>
+                  </pic:nvPicPr>
+                  <pic:blipFill>
+                    <a:blip r:embed="rId102"/>
+                    <a:stretch>
+                      <a:fillRect/>
+                    </a:stretch>
+                  </pic:blipFill>
+                  <pic:spPr>
+                    <a:xfrm>
+                      <a:off x="0" y="0"/>
+                      <a:ext cx="4037067" cy="1762322"/>
+                    </a:xfrm>
+                    <a:prstGeom prst="rect">
+                      <a:avLst/>
+                    </a:prstGeom>
+                  </pic:spPr>
+                </pic:pic>
+              </a:graphicData>
+            </a:graphic>
+          </wp:inline>
+        </w:drawing>
+      </w:r>
+      <w:r>
+        <w:rPr>
+          <w:b/>
+        </w:rPr>
+        <w:drawing>
+          <wp:inline distT="0" distB="0" distL="0" distR="0" wp14:anchorId="261EE4F1" wp14:editId="49C85960">
+            <wp:extent cx="1714739" cy="657317"/>
+            <wp:effectExtent l="0" t="0" r="0" b="9525"/>
+            <wp:docPr id="115" name="Imagem 115"/>
+            <wp:cNvGraphicFramePr>
+              <a:graphicFrameLocks xmlns:a="http://schemas.openxmlformats.org/drawingml/2006/main" noChangeAspect="1"/>
+            </wp:cNvGraphicFramePr>
+            <a:graphic xmlns:a="http://schemas.openxmlformats.org/drawingml/2006/main">
+              <a:graphicData uri="http://schemas.openxmlformats.org/drawingml/2006/picture">
+                <pic:pic xmlns:pic="http://schemas.openxmlformats.org/drawingml/2006/picture">
+                  <pic:nvPicPr>
+                    <pic:cNvPr id="1" name=""/>
+                    <pic:cNvPicPr/>
+                  </pic:nvPicPr>
+                  <pic:blipFill>
+                    <a:blip r:embed="rId103"/>
+                    <a:stretch>
+                      <a:fillRect/>
+                    </a:stretch>
+                  </pic:blipFill>
+                  <pic:spPr>
+                    <a:xfrm>
+                      <a:off x="0" y="0"/>
+                      <a:ext cx="1714739" cy="657317"/>
+                    </a:xfrm>
+                    <a:prstGeom prst="rect">
+                      <a:avLst/>
+                    </a:prstGeom>
+                  </pic:spPr>
+                </pic:pic>
+              </a:graphicData>
+            </a:graphic>
+          </wp:inline>
+        </w:drawing>
+      </w:r>
+    </w:p>
+    <w:p>
+      <w:pPr>
+        <w:rPr>
+          <w:b/>
+        </w:rPr>
+      </w:pPr>
+      <w:r>
+        <w:rPr>
+          <w:b/>
+        </w:rPr>
+        <w:t xml:space="preserve">61- Podemos avaliar que o nosso formulário tem um tipo de comportamento mesmo colocando um elemento em baixo do outro no </w:t>
+      </w:r>
+      <w:proofErr w:type="spellStart"/>
+      <w:r>
+        <w:rPr>
+          <w:b/>
+        </w:rPr>
+        <w:t>html</w:t>
+      </w:r>
+      <w:proofErr w:type="spellEnd"/>
+      <w:r>
+        <w:rPr>
+          <w:b/>
+        </w:rPr>
+        <w:t xml:space="preserve"> ao </w:t>
+      </w:r>
+      <w:proofErr w:type="spellStart"/>
+      <w:r>
+        <w:rPr>
+          <w:b/>
+        </w:rPr>
+        <w:t>renderizar</w:t>
+      </w:r>
+      <w:proofErr w:type="spellEnd"/>
+      <w:r>
+        <w:rPr>
+          <w:b/>
+        </w:rPr>
+        <w:t xml:space="preserve"> a página os elementos (</w:t>
+      </w:r>
+      <w:proofErr w:type="spellStart"/>
+      <w:r>
+        <w:rPr>
+          <w:b/>
+        </w:rPr>
+        <w:t>label</w:t>
+      </w:r>
+      <w:proofErr w:type="spellEnd"/>
+      <w:r>
+        <w:rPr>
+          <w:b/>
+        </w:rPr>
+        <w:t xml:space="preserve"> e input) ficam um do lado do outro. Para mudar essa situação mudamos a natureza do </w:t>
+      </w:r>
+      <w:proofErr w:type="spellStart"/>
+      <w:r>
+        <w:rPr>
+          <w:b/>
+        </w:rPr>
+        <w:t>label</w:t>
+      </w:r>
+      <w:proofErr w:type="spellEnd"/>
+      <w:r>
+        <w:rPr>
+          <w:b/>
+        </w:rPr>
+        <w:t xml:space="preserve"> e input conforme código abaixo.</w:t>
+      </w:r>
+    </w:p>
+    <w:p>
+      <w:pPr>
+        <w:rPr>
+          <w:b/>
+        </w:rPr>
+      </w:pPr>
+      <w:r>
+        <w:rPr>
+          <w:b/>
+        </w:rPr>
+        <w:drawing>
+          <wp:inline distT="0" distB="0" distL="0" distR="0" wp14:anchorId="563DD7B5" wp14:editId="30F5E53A">
+            <wp:extent cx="2038350" cy="1733550"/>
+            <wp:effectExtent l="0" t="0" r="0" b="0"/>
+            <wp:docPr id="117" name="Imagem 117"/>
+            <wp:cNvGraphicFramePr>
+              <a:graphicFrameLocks xmlns:a="http://schemas.openxmlformats.org/drawingml/2006/main" noChangeAspect="1"/>
+            </wp:cNvGraphicFramePr>
+            <a:graphic xmlns:a="http://schemas.openxmlformats.org/drawingml/2006/main">
+              <a:graphicData uri="http://schemas.openxmlformats.org/drawingml/2006/picture">
+                <pic:pic xmlns:pic="http://schemas.openxmlformats.org/drawingml/2006/picture">
+                  <pic:nvPicPr>
+                    <pic:cNvPr id="1" name=""/>
+                    <pic:cNvPicPr/>
+                  </pic:nvPicPr>
+                  <pic:blipFill>
+                    <a:blip r:embed="rId104"/>
+                    <a:stretch>
+                      <a:fillRect/>
+                    </a:stretch>
+                  </pic:blipFill>
+                  <pic:spPr>
+                    <a:xfrm>
+                      <a:off x="0" y="0"/>
+                      <a:ext cx="2038637" cy="1733794"/>
+                    </a:xfrm>
+                    <a:prstGeom prst="rect">
+                      <a:avLst/>
+                    </a:prstGeom>
+                  </pic:spPr>
+                </pic:pic>
+              </a:graphicData>
+            </a:graphic>
+          </wp:inline>
+        </w:drawing>
+      </w:r>
+    </w:p>
+    <w:p>
+      <w:pPr>
+        <w:rPr>
+          <w:b/>
+        </w:rPr>
+      </w:pPr>
+      <w:r>
+        <w:rPr>
+          <w:b/>
+        </w:rPr>
+        <w:t>62-</w:t>
+      </w:r>
       <w:bookmarkStart w:id="0" w:name="_GoBack"/>
       <w:bookmarkEnd w:id="0"/>
+    </w:p>
+    <w:p>
+      <w:pPr>
+        <w:rPr>
+          <w:b/>
+        </w:rPr>
+      </w:pPr>
     </w:p>
     <w:sectPr>
       <w:pgSz w:w="11906" w:h="16838"/>
@@ -7630,6 +8142,7 @@
   <w:style w:type="character" w:default="1" w:styleId="Fontepargpadro">
     <w:name w:val="Default Paragraph Font"/>
     <w:uiPriority w:val="1"/>
+    <w:semiHidden/>
     <w:unhideWhenUsed/>
   </w:style>
   <w:style w:type="table" w:default="1" w:styleId="Tabelanormal">

</xml_diff>